<commit_message>
Clarify blind-box and auction topic titles with matching replacement clips
</commit_message>
<xml_diff>
--- a/delivery/transition21_revision_20261020/Revision_Record.docx
+++ b/delivery/transition21_revision_20261020/Revision_Record.docx
@@ -7,7 +7,7 @@
         <w:pStyle w:val="Title"/>
       </w:pPr>
       <w:r>
-        <w:t>第21页承接句与第27—30页对应修订</w:t>
+        <w:t>第21页承接句与主题标题修订</w:t>
       </w:r>
     </w:p>
     <w:p>
@@ -35,17 +35,23 @@
         <w:t>本地视频已完整解码与首中尾抽帧检查；未实时完整观看；未实际测量新旁白。平台尚未执行修订，不能宣称第21页已发声或27—30错配已修复。</w:t>
       </w:r>
     </w:p>
+    <w:p/>
+    <w:p>
+      <w:r>
+        <w:t>补充：本包现在有3个MP4。除第21页新4秒动态过渡外，第28页“盲盒：开盒体验与分享”17秒及第30页“竞拍：按条件成交”15秒已本地重制主标题；只改这两段主标题，保留原画面、动作、时长和无音轨规格，待平台替换，不代表平台错配已修复。第27/29继续保留正确原片。</w:t>
+      </w:r>
+    </w:p>
     <w:p>
       <w:pPr>
         <w:pStyle w:val="Heading1"/>
       </w:pPr>
       <w:r>
-        <w:t>本次授权的工作稿增补</w:t>
+        <w:t>新工作稿补充</w:t>
       </w:r>
     </w:p>
     <w:p>
       <w:r>
-        <w:t>在原17后额外过渡页新增：“融入生态，共创共享，不再独行。”原V6.2.1冻结稿保留不改，新版本以此修订记录区分；不增加对收益或经营结果的承诺。</w:t>
+        <w:t>第21页新增：“融入生态，共创共享，不再独行。”原V6.2.1冻结源文件不改，新授权补充在本工作稿记录。只有该句是新增旁白；第27—30保持原盲盒、竞拍冻结旁白。</w:t>
       </w:r>
     </w:p>
     <w:sectPr>

</xml_diff>